<commit_message>
nmv 22 02 2026
</commit_message>
<xml_diff>
--- a/TS-Kramam/TS-2.1/TS 2.1 Malayalam Krama Paatam Corrections.docx
+++ b/TS-Kramam/TS-2.1/TS 2.1 Malayalam Krama Paatam Corrections.docx
@@ -254,7 +254,7 @@
       </w:tr>
       <w:tr>
         <w:trPr>
-          <w:trHeight w:val="1573"/>
+          <w:trHeight w:val="1431"/>
         </w:trPr>
         <w:tc>
           <w:tcPr>
@@ -623,7 +623,7 @@
       </w:tr>
       <w:tr>
         <w:trPr>
-          <w:trHeight w:val="906"/>
+          <w:trHeight w:val="1351"/>
         </w:trPr>
         <w:tc>
           <w:tcPr>
@@ -647,8 +647,85 @@
                 <w:b/>
                 <w:sz w:val="28"/>
                 <w:szCs w:val="28"/>
-              </w:rPr>
-            </w:pPr>
+                <w:lang w:val="it-IT"/>
+              </w:rPr>
+            </w:pPr>
+            <w:r>
+              <w:rPr>
+                <w:rFonts w:cs="Arial"/>
+                <w:b/>
+                <w:sz w:val="28"/>
+                <w:szCs w:val="28"/>
+                <w:lang w:val="it-IT"/>
+              </w:rPr>
+              <w:t>TS 2.1.</w:t>
+            </w:r>
+            <w:r>
+              <w:rPr>
+                <w:rFonts w:cs="Arial"/>
+                <w:b/>
+                <w:sz w:val="28"/>
+                <w:szCs w:val="28"/>
+                <w:lang w:val="it-IT"/>
+              </w:rPr>
+              <w:t>4.8</w:t>
+            </w:r>
+            <w:r>
+              <w:rPr>
+                <w:rFonts w:cs="Arial"/>
+                <w:b/>
+                <w:sz w:val="28"/>
+                <w:szCs w:val="28"/>
+                <w:lang w:val="it-IT"/>
+              </w:rPr>
+              <w:t xml:space="preserve"> - Kramam</w:t>
+            </w:r>
+          </w:p>
+          <w:p>
+            <w:pPr>
+              <w:widowControl w:val="0"/>
+              <w:autoSpaceDE w:val="0"/>
+              <w:autoSpaceDN w:val="0"/>
+              <w:adjustRightInd w:val="0"/>
+              <w:spacing w:before="0" w:line="240" w:lineRule="auto"/>
+              <w:rPr>
+                <w:rFonts w:cs="Arial"/>
+                <w:b/>
+                <w:sz w:val="28"/>
+                <w:szCs w:val="28"/>
+                <w:lang w:val="it-IT"/>
+              </w:rPr>
+            </w:pPr>
+            <w:r>
+              <w:rPr>
+                <w:rFonts w:cs="Arial"/>
+                <w:b/>
+                <w:szCs w:val="24"/>
+                <w:lang w:val="it-IT"/>
+              </w:rPr>
+              <w:t>Krama Vaakyam No. 41, 42</w:t>
+            </w:r>
+            <w:r>
+              <w:rPr>
+                <w:rFonts w:cs="Arial"/>
+                <w:b/>
+                <w:sz w:val="28"/>
+                <w:szCs w:val="28"/>
+                <w:lang w:val="it-IT"/>
+              </w:rPr>
+              <w:br/>
+              <w:t xml:space="preserve">Panchaati No.  </w:t>
+            </w:r>
+            <w:r>
+              <w:rPr>
+                <w:rFonts w:cs="Arial"/>
+                <w:b/>
+                <w:sz w:val="28"/>
+                <w:szCs w:val="28"/>
+                <w:lang w:val="it-IT"/>
+              </w:rPr>
+              <w:t>21</w:t>
+            </w:r>
           </w:p>
         </w:tc>
         <w:tc>
@@ -667,14 +744,200 @@
               <w:autoSpaceDE w:val="0"/>
               <w:autoSpaceDN w:val="0"/>
               <w:adjustRightInd w:val="0"/>
-              <w:spacing w:line="252" w:lineRule="auto"/>
+              <w:spacing w:before="0" w:line="240" w:lineRule="auto"/>
+              <w:rPr>
+                <w:rFonts w:ascii="BRH Malayalam Extra" w:hAnsi="BRH Malayalam Extra" w:cs="BRH Malayalam Extra"/>
+                <w:color w:val="000000"/>
+                <w:sz w:val="40"/>
+                <w:szCs w:val="40"/>
+                <w:lang w:val="it-IT"/>
+              </w:rPr>
+            </w:pPr>
+            <w:r>
+              <w:rPr>
+                <w:rFonts w:ascii="BRH Malayalam Extra" w:hAnsi="BRH Malayalam Extra" w:cs="BRH Malayalam Extra"/>
+                <w:color w:val="000000"/>
+                <w:sz w:val="40"/>
+                <w:szCs w:val="40"/>
+                <w:lang w:val="it-IT"/>
+              </w:rPr>
+              <w:t>sï¡</w:t>
+            </w:r>
+            <w:r>
+              <w:rPr>
+                <w:rFonts w:ascii="BRH Malayalam Extra" w:hAnsi="BRH Malayalam Extra" w:cs="BRH Malayalam Extra"/>
+                <w:b/>
+                <w:color w:val="000000"/>
+                <w:sz w:val="32"/>
+                <w:szCs w:val="40"/>
+                <w:lang w:val="it-IT"/>
+              </w:rPr>
+              <w:t>–</w:t>
+            </w:r>
+            <w:r>
+              <w:rPr>
+                <w:rFonts w:ascii="BRH Malayalam Extra" w:hAnsi="BRH Malayalam Extra" w:cs="BRH Malayalam Extra"/>
+                <w:color w:val="000000"/>
+                <w:sz w:val="40"/>
+                <w:szCs w:val="40"/>
+                <w:lang w:val="it-IT"/>
+              </w:rPr>
+              <w:t>p</w:t>
+            </w:r>
+            <w:r>
+              <w:rPr>
+                <w:rFonts w:ascii="BRH Malayalam Extra" w:hAnsi="BRH Malayalam Extra" w:cs="BRH Malayalam Extra"/>
+                <w:b/>
+                <w:color w:val="000000"/>
+                <w:sz w:val="32"/>
+                <w:szCs w:val="40"/>
+                <w:lang w:val="it-IT"/>
+              </w:rPr>
+              <w:t>–</w:t>
+            </w:r>
+            <w:r>
+              <w:rPr>
+                <w:rFonts w:ascii="BRH Malayalam Extra" w:hAnsi="BRH Malayalam Extra" w:cs="BRH Malayalam Extra"/>
+                <w:color w:val="000000"/>
+                <w:sz w:val="40"/>
+                <w:szCs w:val="40"/>
+                <w:lang w:val="it-IT"/>
+              </w:rPr>
+              <w:t>Çy</w:t>
+            </w:r>
+            <w:r>
+              <w:rPr>
+                <w:rFonts w:ascii="BRH Malayalam Extra" w:hAnsi="BRH Malayalam Extra" w:cs="BRH Malayalam Extra"/>
+                <w:b/>
+                <w:color w:val="000000"/>
+                <w:sz w:val="32"/>
+                <w:szCs w:val="40"/>
+                <w:lang w:val="it-IT"/>
+              </w:rPr>
+              <w:t>–</w:t>
+            </w:r>
+            <w:r>
+              <w:rPr>
+                <w:rFonts w:ascii="BRH Malayalam Extra" w:hAnsi="BRH Malayalam Extra" w:cs="BRH Malayalam Extra"/>
+                <w:color w:val="000000"/>
+                <w:sz w:val="40"/>
+                <w:szCs w:val="40"/>
+                <w:lang w:val="it-IT"/>
+              </w:rPr>
+              <w:t xml:space="preserve"> h¡</w:t>
+            </w:r>
+            <w:r>
+              <w:rPr>
+                <w:rFonts w:ascii="BRH Malayalam Extra" w:hAnsi="BRH Malayalam Extra" w:cs="BRH Malayalam Extra"/>
+                <w:b/>
+                <w:color w:val="000000"/>
+                <w:sz w:val="32"/>
+                <w:szCs w:val="40"/>
+                <w:lang w:val="it-IT"/>
+              </w:rPr>
+              <w:t>–</w:t>
+            </w:r>
+            <w:r>
+              <w:rPr>
+                <w:rFonts w:ascii="BRH Malayalam Extra" w:hAnsi="BRH Malayalam Extra" w:cs="BRH Malayalam Extra"/>
+                <w:color w:val="000000"/>
+                <w:sz w:val="40"/>
+                <w:szCs w:val="40"/>
+                <w:highlight w:val="yellow"/>
+                <w:lang w:val="it-IT"/>
+              </w:rPr>
+              <w:t>º</w:t>
+            </w:r>
+            <w:r>
+              <w:rPr>
+                <w:rFonts w:ascii="BRH Malayalam Extra" w:hAnsi="BRH Malayalam Extra" w:cs="BRH Malayalam Extra"/>
+                <w:b/>
+                <w:color w:val="000000"/>
+                <w:sz w:val="32"/>
+                <w:szCs w:val="40"/>
+                <w:lang w:val="it-IT"/>
+              </w:rPr>
+              <w:t>–</w:t>
+            </w:r>
+            <w:r>
+              <w:rPr>
+                <w:rFonts w:ascii="BRH Malayalam Extra" w:hAnsi="BRH Malayalam Extra" w:cs="BRH Malayalam Extra"/>
+                <w:color w:val="000000"/>
+                <w:sz w:val="40"/>
+                <w:szCs w:val="40"/>
+                <w:lang w:val="it-IT"/>
+              </w:rPr>
+              <w:t xml:space="preserve">Zz | </w:t>
+            </w:r>
+          </w:p>
+          <w:p>
+            <w:pPr>
+              <w:widowControl w:val="0"/>
+              <w:autoSpaceDE w:val="0"/>
+              <w:autoSpaceDN w:val="0"/>
+              <w:adjustRightInd w:val="0"/>
+              <w:spacing w:before="0" w:line="240" w:lineRule="auto"/>
               <w:rPr>
                 <w:rFonts w:ascii="BRH Devanagari Extra" w:hAnsi="BRH Devanagari Extra" w:cs="BRH Devanagari Extra"/>
                 <w:color w:val="000000"/>
                 <w:sz w:val="40"/>
                 <w:szCs w:val="40"/>
-              </w:rPr>
-            </w:pPr>
+                <w:lang w:val="it-IT"/>
+              </w:rPr>
+            </w:pPr>
+            <w:r>
+              <w:rPr>
+                <w:rFonts w:ascii="BRH Malayalam Extra" w:hAnsi="BRH Malayalam Extra" w:cs="BRH Malayalam Extra"/>
+                <w:color w:val="000000"/>
+                <w:sz w:val="40"/>
+                <w:szCs w:val="40"/>
+                <w:lang w:val="it-IT"/>
+              </w:rPr>
+              <w:t>h¡</w:t>
+            </w:r>
+            <w:r>
+              <w:rPr>
+                <w:rFonts w:ascii="BRH Malayalam Extra" w:hAnsi="BRH Malayalam Extra" w:cs="BRH Malayalam Extra"/>
+                <w:b/>
+                <w:color w:val="000000"/>
+                <w:sz w:val="32"/>
+                <w:szCs w:val="40"/>
+                <w:lang w:val="it-IT"/>
+              </w:rPr>
+              <w:t>–</w:t>
+            </w:r>
+            <w:r>
+              <w:rPr>
+                <w:rFonts w:ascii="BRH Malayalam Extra" w:hAnsi="BRH Malayalam Extra" w:cs="BRH Malayalam Extra"/>
+                <w:color w:val="000000"/>
+                <w:sz w:val="40"/>
+                <w:szCs w:val="40"/>
+                <w:highlight w:val="yellow"/>
+                <w:lang w:val="it-IT"/>
+              </w:rPr>
+              <w:t>º</w:t>
+            </w:r>
+            <w:r>
+              <w:rPr>
+                <w:rFonts w:ascii="BRH Malayalam Extra" w:hAnsi="BRH Malayalam Extra" w:cs="BRH Malayalam Extra"/>
+                <w:b/>
+                <w:color w:val="000000"/>
+                <w:sz w:val="32"/>
+                <w:szCs w:val="40"/>
+                <w:lang w:val="it-IT"/>
+              </w:rPr>
+              <w:t>–</w:t>
+            </w:r>
+            <w:r>
+              <w:rPr>
+                <w:rFonts w:ascii="BRH Malayalam Extra" w:hAnsi="BRH Malayalam Extra" w:cs="BRH Malayalam Extra"/>
+                <w:color w:val="000000"/>
+                <w:sz w:val="40"/>
+                <w:szCs w:val="40"/>
+                <w:lang w:val="it-IT"/>
+              </w:rPr>
+              <w:t>¥Zõ—dI |</w:t>
+            </w:r>
           </w:p>
         </w:tc>
         <w:tc>
@@ -693,14 +956,655 @@
               <w:autoSpaceDE w:val="0"/>
               <w:autoSpaceDN w:val="0"/>
               <w:adjustRightInd w:val="0"/>
+              <w:spacing w:before="0" w:line="240" w:lineRule="auto"/>
+              <w:rPr>
+                <w:rFonts w:ascii="BRH Malayalam Extra" w:hAnsi="BRH Malayalam Extra" w:cs="BRH Malayalam Extra"/>
+                <w:color w:val="000000"/>
+                <w:sz w:val="40"/>
+                <w:szCs w:val="40"/>
+                <w:lang w:val="it-IT"/>
+              </w:rPr>
+            </w:pPr>
+            <w:r>
+              <w:rPr>
+                <w:rFonts w:ascii="BRH Malayalam Extra" w:hAnsi="BRH Malayalam Extra" w:cs="BRH Malayalam Extra"/>
+                <w:color w:val="000000"/>
+                <w:sz w:val="40"/>
+                <w:szCs w:val="40"/>
+                <w:lang w:val="it-IT"/>
+              </w:rPr>
+              <w:t>sï¡</w:t>
+            </w:r>
+            <w:r>
+              <w:rPr>
+                <w:rFonts w:ascii="BRH Malayalam Extra" w:hAnsi="BRH Malayalam Extra" w:cs="BRH Malayalam Extra"/>
+                <w:b/>
+                <w:color w:val="000000"/>
+                <w:sz w:val="32"/>
+                <w:szCs w:val="40"/>
+                <w:lang w:val="it-IT"/>
+              </w:rPr>
+              <w:t>–</w:t>
+            </w:r>
+            <w:r>
+              <w:rPr>
+                <w:rFonts w:ascii="BRH Malayalam Extra" w:hAnsi="BRH Malayalam Extra" w:cs="BRH Malayalam Extra"/>
+                <w:color w:val="000000"/>
+                <w:sz w:val="40"/>
+                <w:szCs w:val="40"/>
+                <w:lang w:val="it-IT"/>
+              </w:rPr>
+              <w:t>p</w:t>
+            </w:r>
+            <w:r>
+              <w:rPr>
+                <w:rFonts w:ascii="BRH Malayalam Extra" w:hAnsi="BRH Malayalam Extra" w:cs="BRH Malayalam Extra"/>
+                <w:b/>
+                <w:color w:val="000000"/>
+                <w:sz w:val="32"/>
+                <w:szCs w:val="40"/>
+                <w:lang w:val="it-IT"/>
+              </w:rPr>
+              <w:t>–</w:t>
+            </w:r>
+            <w:r>
+              <w:rPr>
+                <w:rFonts w:ascii="BRH Malayalam Extra" w:hAnsi="BRH Malayalam Extra" w:cs="BRH Malayalam Extra"/>
+                <w:color w:val="000000"/>
+                <w:sz w:val="40"/>
+                <w:szCs w:val="40"/>
+                <w:lang w:val="it-IT"/>
+              </w:rPr>
+              <w:t>Çy</w:t>
+            </w:r>
+            <w:r>
+              <w:rPr>
+                <w:rFonts w:ascii="BRH Malayalam Extra" w:hAnsi="BRH Malayalam Extra" w:cs="BRH Malayalam Extra"/>
+                <w:b/>
+                <w:color w:val="000000"/>
+                <w:sz w:val="32"/>
+                <w:szCs w:val="40"/>
+                <w:lang w:val="it-IT"/>
+              </w:rPr>
+              <w:t>–</w:t>
+            </w:r>
+            <w:r>
+              <w:rPr>
+                <w:rFonts w:ascii="BRH Malayalam Extra" w:hAnsi="BRH Malayalam Extra" w:cs="BRH Malayalam Extra"/>
+                <w:color w:val="000000"/>
+                <w:sz w:val="40"/>
+                <w:szCs w:val="40"/>
+                <w:lang w:val="it-IT"/>
+              </w:rPr>
+              <w:t xml:space="preserve"> h¡</w:t>
+            </w:r>
+            <w:r>
+              <w:rPr>
+                <w:rFonts w:ascii="BRH Malayalam Extra" w:hAnsi="BRH Malayalam Extra" w:cs="BRH Malayalam Extra"/>
+                <w:b/>
+                <w:color w:val="000000"/>
+                <w:sz w:val="32"/>
+                <w:szCs w:val="40"/>
+                <w:lang w:val="it-IT"/>
+              </w:rPr>
+              <w:t>–</w:t>
+            </w:r>
+            <w:r>
+              <w:rPr>
+                <w:rFonts w:ascii="BRH Malayalam Extra" w:hAnsi="BRH Malayalam Extra" w:cs="BRH Malayalam Extra"/>
+                <w:color w:val="000000"/>
+                <w:sz w:val="40"/>
+                <w:szCs w:val="48"/>
+                <w:highlight w:val="green"/>
+                <w:lang w:val="it-IT"/>
+              </w:rPr>
+              <w:t>Ø</w:t>
+            </w:r>
+            <w:r>
+              <w:rPr>
+                <w:rFonts w:ascii="BRH Malayalam Extra" w:hAnsi="BRH Malayalam Extra" w:cs="BRH Malayalam Extra"/>
+                <w:b/>
+                <w:color w:val="000000"/>
+                <w:sz w:val="32"/>
+                <w:szCs w:val="40"/>
+                <w:lang w:val="it-IT"/>
+              </w:rPr>
+              <w:t>–</w:t>
+            </w:r>
+            <w:r>
+              <w:rPr>
+                <w:rFonts w:ascii="BRH Malayalam Extra" w:hAnsi="BRH Malayalam Extra" w:cs="BRH Malayalam Extra"/>
+                <w:color w:val="000000"/>
+                <w:sz w:val="40"/>
+                <w:szCs w:val="40"/>
+                <w:lang w:val="it-IT"/>
+              </w:rPr>
+              <w:t xml:space="preserve">Zz | </w:t>
+            </w:r>
+          </w:p>
+          <w:p>
+            <w:pPr>
+              <w:widowControl w:val="0"/>
+              <w:autoSpaceDE w:val="0"/>
+              <w:autoSpaceDN w:val="0"/>
+              <w:adjustRightInd w:val="0"/>
+              <w:spacing w:before="0" w:line="240" w:lineRule="auto"/>
+              <w:rPr>
+                <w:rFonts w:ascii="BRH Devanagari Extra" w:hAnsi="BRH Devanagari Extra" w:cs="BRH Devanagari Extra"/>
+                <w:color w:val="000000"/>
+                <w:sz w:val="40"/>
+                <w:szCs w:val="40"/>
+                <w:lang w:val="it-IT"/>
+              </w:rPr>
+            </w:pPr>
+            <w:r>
+              <w:rPr>
+                <w:rFonts w:ascii="BRH Malayalam Extra" w:hAnsi="BRH Malayalam Extra" w:cs="BRH Malayalam Extra"/>
+                <w:color w:val="000000"/>
+                <w:sz w:val="40"/>
+                <w:szCs w:val="40"/>
+                <w:lang w:val="it-IT"/>
+              </w:rPr>
+              <w:t>h¡</w:t>
+            </w:r>
+            <w:r>
+              <w:rPr>
+                <w:rFonts w:ascii="BRH Malayalam Extra" w:hAnsi="BRH Malayalam Extra" w:cs="BRH Malayalam Extra"/>
+                <w:b/>
+                <w:color w:val="000000"/>
+                <w:sz w:val="32"/>
+                <w:szCs w:val="40"/>
+                <w:lang w:val="it-IT"/>
+              </w:rPr>
+              <w:t>–</w:t>
+            </w:r>
+            <w:r>
+              <w:rPr>
+                <w:rFonts w:ascii="BRH Malayalam Extra" w:hAnsi="BRH Malayalam Extra" w:cs="BRH Malayalam Extra"/>
+                <w:color w:val="000000"/>
+                <w:sz w:val="40"/>
+                <w:szCs w:val="48"/>
+                <w:highlight w:val="green"/>
+                <w:lang w:val="it-IT"/>
+              </w:rPr>
+              <w:t>Ø</w:t>
+            </w:r>
+            <w:r>
+              <w:rPr>
+                <w:rFonts w:ascii="BRH Malayalam Extra" w:hAnsi="BRH Malayalam Extra" w:cs="BRH Malayalam Extra"/>
+                <w:b/>
+                <w:color w:val="000000"/>
+                <w:sz w:val="32"/>
+                <w:szCs w:val="40"/>
+                <w:lang w:val="it-IT"/>
+              </w:rPr>
+              <w:t>–</w:t>
+            </w:r>
+            <w:r>
+              <w:rPr>
+                <w:rFonts w:ascii="BRH Malayalam Extra" w:hAnsi="BRH Malayalam Extra" w:cs="BRH Malayalam Extra"/>
+                <w:color w:val="000000"/>
+                <w:sz w:val="40"/>
+                <w:szCs w:val="40"/>
+                <w:lang w:val="it-IT"/>
+              </w:rPr>
+              <w:t>¥Zõ—dI |</w:t>
+            </w:r>
+          </w:p>
+        </w:tc>
+      </w:tr>
+      <w:tr>
+        <w:trPr>
+          <w:trHeight w:val="1599"/>
+        </w:trPr>
+        <w:tc>
+          <w:tcPr>
+            <w:tcW w:w="3573" w:type="dxa"/>
+            <w:tcBorders>
+              <w:top w:val="single" w:sz="4" w:space="0" w:color="000000"/>
+              <w:left w:val="single" w:sz="4" w:space="0" w:color="000000"/>
+              <w:bottom w:val="single" w:sz="4" w:space="0" w:color="000000"/>
+              <w:right w:val="single" w:sz="4" w:space="0" w:color="000000"/>
+            </w:tcBorders>
+          </w:tcPr>
+          <w:p>
+            <w:pPr>
+              <w:widowControl w:val="0"/>
+              <w:autoSpaceDE w:val="0"/>
+              <w:autoSpaceDN w:val="0"/>
+              <w:adjustRightInd w:val="0"/>
+              <w:spacing w:before="0" w:line="240" w:lineRule="auto"/>
+              <w:rPr>
+                <w:rFonts w:cs="Arial"/>
+                <w:b/>
+                <w:sz w:val="28"/>
+                <w:szCs w:val="28"/>
+                <w:lang w:val="it-IT"/>
+              </w:rPr>
+            </w:pPr>
+            <w:r>
+              <w:rPr>
+                <w:rFonts w:cs="Arial"/>
+                <w:b/>
+                <w:sz w:val="28"/>
+                <w:szCs w:val="28"/>
+                <w:lang w:val="it-IT"/>
+              </w:rPr>
+              <w:t>TS 2.1.</w:t>
+            </w:r>
+            <w:r>
+              <w:rPr>
+                <w:rFonts w:cs="Arial"/>
+                <w:b/>
+                <w:sz w:val="28"/>
+                <w:szCs w:val="28"/>
+                <w:lang w:val="it-IT"/>
+              </w:rPr>
+              <w:t>7.7</w:t>
+            </w:r>
+            <w:r>
+              <w:rPr>
+                <w:rFonts w:cs="Arial"/>
+                <w:b/>
+                <w:sz w:val="28"/>
+                <w:szCs w:val="28"/>
+                <w:lang w:val="it-IT"/>
+              </w:rPr>
+              <w:t xml:space="preserve"> - Kramam</w:t>
+            </w:r>
+          </w:p>
+          <w:p>
+            <w:pPr>
+              <w:widowControl w:val="0"/>
+              <w:autoSpaceDE w:val="0"/>
+              <w:autoSpaceDN w:val="0"/>
+              <w:adjustRightInd w:val="0"/>
+              <w:spacing w:before="0" w:line="240" w:lineRule="auto"/>
+              <w:rPr>
+                <w:rFonts w:cs="Arial"/>
+                <w:b/>
+                <w:sz w:val="28"/>
+                <w:szCs w:val="28"/>
+                <w:lang w:val="it-IT"/>
+              </w:rPr>
+            </w:pPr>
+            <w:r>
+              <w:rPr>
+                <w:rFonts w:cs="Arial"/>
+                <w:b/>
+                <w:sz w:val="28"/>
+                <w:szCs w:val="28"/>
+                <w:lang w:val="it-IT"/>
+              </w:rPr>
+              <w:t xml:space="preserve">Krama Vaakyam No. </w:t>
+            </w:r>
+            <w:r>
+              <w:rPr>
+                <w:rFonts w:cs="Arial"/>
+                <w:b/>
+                <w:sz w:val="28"/>
+                <w:szCs w:val="28"/>
+                <w:lang w:val="it-IT"/>
+              </w:rPr>
+              <w:t>74</w:t>
+            </w:r>
+            <w:r>
+              <w:rPr>
+                <w:rFonts w:cs="Arial"/>
+                <w:b/>
+                <w:sz w:val="28"/>
+                <w:szCs w:val="28"/>
+                <w:lang w:val="it-IT"/>
+              </w:rPr>
+              <w:br/>
+              <w:t xml:space="preserve">Panchaati No.  </w:t>
+            </w:r>
+            <w:r>
+              <w:rPr>
+                <w:rFonts w:cs="Arial"/>
+                <w:b/>
+                <w:sz w:val="28"/>
+                <w:szCs w:val="28"/>
+                <w:lang w:val="it-IT"/>
+              </w:rPr>
+              <w:t>47</w:t>
+            </w:r>
+          </w:p>
+        </w:tc>
+        <w:tc>
+          <w:tcPr>
+            <w:tcW w:w="4896" w:type="dxa"/>
+            <w:tcBorders>
+              <w:top w:val="single" w:sz="4" w:space="0" w:color="000000"/>
+              <w:left w:val="single" w:sz="4" w:space="0" w:color="000000"/>
+              <w:bottom w:val="single" w:sz="4" w:space="0" w:color="000000"/>
+              <w:right w:val="single" w:sz="4" w:space="0" w:color="000000"/>
+            </w:tcBorders>
+          </w:tcPr>
+          <w:p>
+            <w:pPr>
+              <w:widowControl w:val="0"/>
+              <w:autoSpaceDE w:val="0"/>
+              <w:autoSpaceDN w:val="0"/>
+              <w:adjustRightInd w:val="0"/>
               <w:spacing w:line="252" w:lineRule="auto"/>
               <w:rPr>
-                <w:rFonts w:ascii="BRH Devanagari Extra" w:hAnsi="BRH Devanagari Extra" w:cs="BRH Devanagari Extra"/>
-                <w:color w:val="000000"/>
-                <w:sz w:val="40"/>
-                <w:szCs w:val="40"/>
-              </w:rPr>
-            </w:pPr>
+                <w:rFonts w:ascii="BRH Malayalam Extra" w:hAnsi="BRH Malayalam Extra" w:cs="BRH Malayalam Extra"/>
+                <w:color w:val="000000"/>
+                <w:sz w:val="40"/>
+                <w:szCs w:val="40"/>
+                <w:lang w:val="it-IT"/>
+              </w:rPr>
+            </w:pPr>
+            <w:r>
+              <w:rPr>
+                <w:rFonts w:ascii="BRH Malayalam Extra" w:hAnsi="BRH Malayalam Extra" w:cs="BRH Malayalam Extra"/>
+                <w:color w:val="000000"/>
+                <w:sz w:val="40"/>
+                <w:szCs w:val="40"/>
+                <w:lang w:val="it-IT"/>
+              </w:rPr>
+              <w:t>C</w:t>
+            </w:r>
+            <w:r>
+              <w:rPr>
+                <w:rFonts w:ascii="BRH Malayalam Extra" w:hAnsi="BRH Malayalam Extra" w:cs="BRH Malayalam Extra"/>
+                <w:b/>
+                <w:color w:val="000000"/>
+                <w:sz w:val="32"/>
+                <w:szCs w:val="40"/>
+                <w:lang w:val="it-IT"/>
+              </w:rPr>
+              <w:t>–</w:t>
+            </w:r>
+            <w:r>
+              <w:rPr>
+                <w:rFonts w:ascii="BRH Malayalam Extra" w:hAnsi="BRH Malayalam Extra" w:cs="BRH Malayalam Extra"/>
+                <w:color w:val="000000"/>
+                <w:sz w:val="40"/>
+                <w:szCs w:val="40"/>
+                <w:lang w:val="it-IT"/>
+              </w:rPr>
+              <w:t>¥côx hy</w:t>
+            </w:r>
+            <w:r>
+              <w:rPr>
+                <w:rFonts w:ascii="BRH Malayalam Extra" w:hAnsi="BRH Malayalam Extra" w:cs="BRH Malayalam Extra"/>
+                <w:b/>
+                <w:color w:val="000000"/>
+                <w:sz w:val="32"/>
+                <w:szCs w:val="40"/>
+                <w:lang w:val="it-IT"/>
+              </w:rPr>
+              <w:t>–</w:t>
+            </w:r>
+            <w:r>
+              <w:rPr>
+                <w:rFonts w:ascii="BRH Malayalam Extra" w:hAnsi="BRH Malayalam Extra" w:cs="BRH Malayalam Extra"/>
+                <w:color w:val="000000"/>
+                <w:sz w:val="40"/>
+                <w:szCs w:val="40"/>
+                <w:lang w:val="it-IT"/>
+              </w:rPr>
+              <w:t xml:space="preserve">dÀy— | </w:t>
+            </w:r>
+          </w:p>
+          <w:p>
+            <w:pPr>
+              <w:widowControl w:val="0"/>
+              <w:autoSpaceDE w:val="0"/>
+              <w:autoSpaceDN w:val="0"/>
+              <w:adjustRightInd w:val="0"/>
+              <w:spacing w:before="0" w:line="240" w:lineRule="auto"/>
+              <w:rPr>
+                <w:rFonts w:ascii="BRH Malayalam Extra" w:hAnsi="BRH Malayalam Extra" w:cs="BRH Malayalam Extra"/>
+                <w:color w:val="000000"/>
+                <w:sz w:val="40"/>
+                <w:szCs w:val="40"/>
+                <w:lang w:val="it-IT"/>
+              </w:rPr>
+            </w:pPr>
+            <w:r>
+              <w:rPr>
+                <w:rFonts w:ascii="BRH Malayalam Extra" w:hAnsi="BRH Malayalam Extra" w:cs="BRH Malayalam Extra"/>
+                <w:color w:val="000000"/>
+                <w:sz w:val="40"/>
+                <w:szCs w:val="40"/>
+                <w:lang w:val="it-IT"/>
+              </w:rPr>
+              <w:t>hy</w:t>
+            </w:r>
+            <w:r>
+              <w:rPr>
+                <w:rFonts w:ascii="BRH Malayalam Extra" w:hAnsi="BRH Malayalam Extra" w:cs="BRH Malayalam Extra"/>
+                <w:b/>
+                <w:color w:val="000000"/>
+                <w:sz w:val="32"/>
+                <w:szCs w:val="40"/>
+                <w:lang w:val="it-IT"/>
+              </w:rPr>
+              <w:t>–</w:t>
+            </w:r>
+            <w:r>
+              <w:rPr>
+                <w:rFonts w:ascii="BRH Malayalam Extra" w:hAnsi="BRH Malayalam Extra" w:cs="BRH Malayalam Extra"/>
+                <w:color w:val="000000"/>
+                <w:sz w:val="40"/>
+                <w:szCs w:val="40"/>
+                <w:lang w:val="it-IT"/>
+              </w:rPr>
+              <w:t>d¥</w:t>
+            </w:r>
+            <w:r>
+              <w:rPr>
+                <w:rFonts w:ascii="BRH Malayalam Extra" w:hAnsi="BRH Malayalam Extra" w:cs="BRH Malayalam Extra"/>
+                <w:color w:val="000000"/>
+                <w:sz w:val="40"/>
+                <w:szCs w:val="40"/>
+                <w:highlight w:val="yellow"/>
+                <w:lang w:val="it-IT"/>
+              </w:rPr>
+              <w:t>Z</w:t>
+            </w:r>
+            <w:r>
+              <w:rPr>
+                <w:rFonts w:ascii="BRH Malayalam Extra" w:hAnsi="BRH Malayalam Extra" w:cs="BRH Malayalam Extra"/>
+                <w:color w:val="000000"/>
+                <w:sz w:val="40"/>
+                <w:szCs w:val="40"/>
+                <w:lang w:val="it-IT"/>
+              </w:rPr>
+              <w:t>õ</w:t>
+            </w:r>
+            <w:r>
+              <w:rPr>
+                <w:rFonts w:ascii="BRH Malayalam Extra" w:hAnsi="BRH Malayalam Extra" w:cs="BRH Malayalam Extra"/>
+                <w:b/>
+                <w:color w:val="000000"/>
+                <w:sz w:val="32"/>
+                <w:szCs w:val="40"/>
+                <w:lang w:val="it-IT"/>
+              </w:rPr>
+              <w:t>–</w:t>
+            </w:r>
+            <w:r>
+              <w:rPr>
+                <w:rFonts w:ascii="BRH Malayalam Extra" w:hAnsi="BRH Malayalam Extra" w:cs="BRH Malayalam Extra"/>
+                <w:color w:val="000000"/>
+                <w:sz w:val="40"/>
+                <w:szCs w:val="40"/>
+                <w:lang w:val="it-IT"/>
+              </w:rPr>
+              <w:t>p |</w:t>
+            </w:r>
+          </w:p>
+        </w:tc>
+        <w:tc>
+          <w:tcPr>
+            <w:tcW w:w="5220" w:type="dxa"/>
+            <w:tcBorders>
+              <w:top w:val="single" w:sz="4" w:space="0" w:color="000000"/>
+              <w:left w:val="single" w:sz="4" w:space="0" w:color="000000"/>
+              <w:bottom w:val="single" w:sz="4" w:space="0" w:color="000000"/>
+              <w:right w:val="single" w:sz="4" w:space="0" w:color="000000"/>
+            </w:tcBorders>
+          </w:tcPr>
+          <w:p>
+            <w:pPr>
+              <w:widowControl w:val="0"/>
+              <w:autoSpaceDE w:val="0"/>
+              <w:autoSpaceDN w:val="0"/>
+              <w:adjustRightInd w:val="0"/>
+              <w:spacing w:line="252" w:lineRule="auto"/>
+              <w:rPr>
+                <w:rFonts w:ascii="BRH Malayalam Extra" w:hAnsi="BRH Malayalam Extra" w:cs="BRH Malayalam Extra"/>
+                <w:color w:val="000000"/>
+                <w:sz w:val="40"/>
+                <w:szCs w:val="40"/>
+                <w:lang w:val="it-IT"/>
+              </w:rPr>
+            </w:pPr>
+            <w:r>
+              <w:rPr>
+                <w:rFonts w:ascii="BRH Malayalam Extra" w:hAnsi="BRH Malayalam Extra" w:cs="BRH Malayalam Extra"/>
+                <w:color w:val="000000"/>
+                <w:sz w:val="40"/>
+                <w:szCs w:val="40"/>
+                <w:lang w:val="it-IT"/>
+              </w:rPr>
+              <w:t>C</w:t>
+            </w:r>
+            <w:r>
+              <w:rPr>
+                <w:rFonts w:ascii="BRH Malayalam Extra" w:hAnsi="BRH Malayalam Extra" w:cs="BRH Malayalam Extra"/>
+                <w:b/>
+                <w:color w:val="000000"/>
+                <w:sz w:val="32"/>
+                <w:szCs w:val="40"/>
+                <w:lang w:val="it-IT"/>
+              </w:rPr>
+              <w:t>–</w:t>
+            </w:r>
+            <w:r>
+              <w:rPr>
+                <w:rFonts w:ascii="BRH Malayalam Extra" w:hAnsi="BRH Malayalam Extra" w:cs="BRH Malayalam Extra"/>
+                <w:color w:val="000000"/>
+                <w:sz w:val="40"/>
+                <w:szCs w:val="40"/>
+                <w:lang w:val="it-IT"/>
+              </w:rPr>
+              <w:t>¥côx hy</w:t>
+            </w:r>
+            <w:r>
+              <w:rPr>
+                <w:rFonts w:ascii="BRH Malayalam Extra" w:hAnsi="BRH Malayalam Extra" w:cs="BRH Malayalam Extra"/>
+                <w:b/>
+                <w:color w:val="000000"/>
+                <w:sz w:val="32"/>
+                <w:szCs w:val="40"/>
+                <w:lang w:val="it-IT"/>
+              </w:rPr>
+              <w:t>–</w:t>
+            </w:r>
+            <w:r>
+              <w:rPr>
+                <w:rFonts w:ascii="BRH Malayalam Extra" w:hAnsi="BRH Malayalam Extra" w:cs="BRH Malayalam Extra"/>
+                <w:color w:val="000000"/>
+                <w:sz w:val="40"/>
+                <w:szCs w:val="40"/>
+                <w:lang w:val="it-IT"/>
+              </w:rPr>
+              <w:t xml:space="preserve">dÀy— | </w:t>
+            </w:r>
+          </w:p>
+          <w:p>
+            <w:pPr>
+              <w:widowControl w:val="0"/>
+              <w:autoSpaceDE w:val="0"/>
+              <w:autoSpaceDN w:val="0"/>
+              <w:adjustRightInd w:val="0"/>
+              <w:spacing w:before="0" w:line="240" w:lineRule="auto"/>
+              <w:rPr>
+                <w:rFonts w:ascii="BRH Malayalam Extra" w:hAnsi="BRH Malayalam Extra" w:cs="BRH Malayalam Extra"/>
+                <w:color w:val="000000"/>
+                <w:sz w:val="40"/>
+                <w:szCs w:val="40"/>
+                <w:lang w:val="it-IT"/>
+              </w:rPr>
+            </w:pPr>
+            <w:r>
+              <w:rPr>
+                <w:rFonts w:ascii="BRH Malayalam Extra" w:hAnsi="BRH Malayalam Extra" w:cs="BRH Malayalam Extra"/>
+                <w:color w:val="000000"/>
+                <w:sz w:val="40"/>
+                <w:szCs w:val="40"/>
+                <w:lang w:val="it-IT"/>
+              </w:rPr>
+              <w:t>hy</w:t>
+            </w:r>
+            <w:r>
+              <w:rPr>
+                <w:rFonts w:ascii="BRH Malayalam Extra" w:hAnsi="BRH Malayalam Extra" w:cs="BRH Malayalam Extra"/>
+                <w:b/>
+                <w:color w:val="000000"/>
+                <w:sz w:val="32"/>
+                <w:szCs w:val="40"/>
+                <w:lang w:val="it-IT"/>
+              </w:rPr>
+              <w:t>–</w:t>
+            </w:r>
+            <w:r>
+              <w:rPr>
+                <w:rFonts w:ascii="BRH Malayalam Extra" w:hAnsi="BRH Malayalam Extra" w:cs="BRH Malayalam Extra"/>
+                <w:color w:val="000000"/>
+                <w:sz w:val="40"/>
+                <w:szCs w:val="40"/>
+                <w:lang w:val="it-IT"/>
+              </w:rPr>
+              <w:t>d¥</w:t>
+            </w:r>
+            <w:r>
+              <w:rPr>
+                <w:rFonts w:ascii="BRH Malayalam Extra" w:hAnsi="BRH Malayalam Extra" w:cs="BRH Malayalam Extra"/>
+                <w:color w:val="000000"/>
+                <w:sz w:val="40"/>
+                <w:szCs w:val="40"/>
+                <w:highlight w:val="green"/>
+                <w:lang w:val="it-IT"/>
+              </w:rPr>
+              <w:t>À</w:t>
+            </w:r>
+            <w:r>
+              <w:rPr>
+                <w:rFonts w:ascii="BRH Malayalam Extra" w:hAnsi="BRH Malayalam Extra" w:cs="BRH Malayalam Extra"/>
+                <w:color w:val="000000"/>
+                <w:sz w:val="40"/>
+                <w:szCs w:val="40"/>
+                <w:lang w:val="it-IT"/>
+              </w:rPr>
+              <w:t>õ</w:t>
+            </w:r>
+            <w:r>
+              <w:rPr>
+                <w:rFonts w:ascii="BRH Malayalam Extra" w:hAnsi="BRH Malayalam Extra" w:cs="BRH Malayalam Extra"/>
+                <w:b/>
+                <w:color w:val="000000"/>
+                <w:sz w:val="32"/>
+                <w:szCs w:val="40"/>
+                <w:lang w:val="it-IT"/>
+              </w:rPr>
+              <w:t>–</w:t>
+            </w:r>
+            <w:r>
+              <w:rPr>
+                <w:rFonts w:ascii="BRH Malayalam Extra" w:hAnsi="BRH Malayalam Extra" w:cs="BRH Malayalam Extra"/>
+                <w:color w:val="000000"/>
+                <w:sz w:val="40"/>
+                <w:szCs w:val="40"/>
+                <w:lang w:val="it-IT"/>
+              </w:rPr>
+              <w:t>p |</w:t>
+            </w:r>
           </w:p>
         </w:tc>
       </w:tr>
@@ -714,6 +1618,7 @@
           <w:sz w:val="32"/>
           <w:szCs w:val="32"/>
           <w:u w:val="single"/>
+          <w:lang w:val="it-IT"/>
         </w:rPr>
       </w:pPr>
     </w:p>
@@ -726,6 +1631,7 @@
           <w:sz w:val="32"/>
           <w:szCs w:val="32"/>
           <w:u w:val="single"/>
+          <w:lang w:val="it-IT"/>
         </w:rPr>
       </w:pPr>
     </w:p>
@@ -738,6 +1644,7 @@
           <w:sz w:val="32"/>
           <w:szCs w:val="32"/>
           <w:u w:val="single"/>
+          <w:lang w:val="it-IT"/>
         </w:rPr>
       </w:pPr>
     </w:p>
@@ -932,6 +1839,7 @@
                 <w:sz w:val="28"/>
                 <w:szCs w:val="28"/>
               </w:rPr>
+              <w:lastRenderedPageBreak/>
               <w:t>Reference</w:t>
             </w:r>
           </w:p>
@@ -958,6 +1866,7 @@
                 <w:sz w:val="28"/>
                 <w:szCs w:val="28"/>
               </w:rPr>
+              <w:lastRenderedPageBreak/>
               <w:t>As Printed</w:t>
             </w:r>
           </w:p>
@@ -1372,7 +2281,6 @@
                 <w:szCs w:val="28"/>
                 <w:lang w:val="it-IT"/>
               </w:rPr>
-              <w:lastRenderedPageBreak/>
               <w:t>TS 2.1.8.1 - Kramam</w:t>
             </w:r>
           </w:p>
@@ -2921,6 +3829,7 @@
                 <w:sz w:val="28"/>
                 <w:szCs w:val="28"/>
               </w:rPr>
+              <w:lastRenderedPageBreak/>
               <w:t>Reference</w:t>
             </w:r>
           </w:p>
@@ -2947,6 +3856,7 @@
                 <w:sz w:val="28"/>
                 <w:szCs w:val="28"/>
               </w:rPr>
+              <w:lastRenderedPageBreak/>
               <w:t>As Printed</w:t>
             </w:r>
           </w:p>
@@ -3191,7 +4101,6 @@
                 <w:sz w:val="40"/>
                 <w:szCs w:val="40"/>
               </w:rPr>
-              <w:lastRenderedPageBreak/>
               <w:t>ög</w:t>
             </w:r>
             <w:r>
@@ -3373,7 +4282,6 @@
                 <w:sz w:val="40"/>
                 <w:szCs w:val="40"/>
               </w:rPr>
-              <w:lastRenderedPageBreak/>
               <w:t>g</w:t>
             </w:r>
             <w:r>
@@ -3495,7 +4403,6 @@
                 <w:sz w:val="40"/>
                 <w:szCs w:val="40"/>
               </w:rPr>
-              <w:lastRenderedPageBreak/>
               <w:t>ög</w:t>
             </w:r>
             <w:r>
@@ -3681,7 +4588,6 @@
                 <w:szCs w:val="28"/>
                 <w:lang w:val="it-IT"/>
               </w:rPr>
-              <w:lastRenderedPageBreak/>
               <w:t>TS 2.1.11.4 - Kramam</w:t>
             </w:r>
           </w:p>
@@ -4920,6 +5826,7 @@
                 <w:sz w:val="28"/>
                 <w:szCs w:val="28"/>
               </w:rPr>
+              <w:lastRenderedPageBreak/>
               <w:t>TS 2.1.4.2</w:t>
             </w:r>
             <w:r>
@@ -5310,7 +6217,6 @@
                 <w:sz w:val="28"/>
                 <w:szCs w:val="28"/>
               </w:rPr>
-              <w:lastRenderedPageBreak/>
               <w:t>TS 2.1.4.2</w:t>
             </w:r>
             <w:r>
@@ -7669,6 +8575,7 @@
                 <w:sz w:val="28"/>
                 <w:szCs w:val="28"/>
               </w:rPr>
+              <w:lastRenderedPageBreak/>
               <w:t xml:space="preserve">TS 2.1.6.1 </w:t>
             </w:r>
             <w:r>
@@ -8112,7 +9019,6 @@
                 <w:sz w:val="28"/>
                 <w:szCs w:val="28"/>
               </w:rPr>
-              <w:lastRenderedPageBreak/>
               <w:t>TS 2.1.7.2</w:t>
             </w:r>
             <w:r>
@@ -9967,6 +10873,7 @@
                 <w:sz w:val="28"/>
                 <w:szCs w:val="28"/>
               </w:rPr>
+              <w:lastRenderedPageBreak/>
               <w:t xml:space="preserve">TS 2.1.11.1 </w:t>
             </w:r>
             <w:r>
@@ -10293,7 +11200,6 @@
                 <w:sz w:val="28"/>
                 <w:szCs w:val="28"/>
               </w:rPr>
-              <w:lastRenderedPageBreak/>
               <w:t xml:space="preserve">TS 2.1.11.5 </w:t>
             </w:r>
             <w:r>
@@ -11489,6 +12395,7 @@
                 <w:sz w:val="28"/>
                 <w:szCs w:val="28"/>
               </w:rPr>
+              <w:lastRenderedPageBreak/>
               <w:t>Reference</w:t>
             </w:r>
           </w:p>
@@ -11515,6 +12422,7 @@
                 <w:sz w:val="28"/>
                 <w:szCs w:val="28"/>
               </w:rPr>
+              <w:lastRenderedPageBreak/>
               <w:t>As Printed</w:t>
             </w:r>
           </w:p>

</xml_diff>

<commit_message>
nmv 12 03 2026
</commit_message>
<xml_diff>
--- a/TS-Kramam/TS-2.1/TS 2.1 Malayalam Krama Paatam Corrections.docx
+++ b/TS-Kramam/TS-2.1/TS 2.1 Malayalam Krama Paatam Corrections.docx
@@ -101,7 +101,18 @@
           <w:szCs w:val="32"/>
           <w:u w:val="single"/>
         </w:rPr>
-        <w:t xml:space="preserve">Observed till </w:t>
+        <w:t xml:space="preserve">Observed </w:t>
+      </w:r>
+      <w:proofErr w:type="gramStart"/>
+      <w:r>
+        <w:rPr>
+          <w:b/>
+          <w:bCs/>
+          <w:sz w:val="32"/>
+          <w:szCs w:val="32"/>
+          <w:u w:val="single"/>
+        </w:rPr>
+        <w:t xml:space="preserve">till </w:t>
       </w:r>
       <w:r>
         <w:rPr>
@@ -114,6 +125,7 @@
         </w:rPr>
         <w:t>????</w:t>
       </w:r>
+      <w:proofErr w:type="gramEnd"/>
     </w:p>
     <w:p>
       <w:pPr>
@@ -1604,6 +1616,309 @@
                 <w:lang w:val="it-IT"/>
               </w:rPr>
               <w:t>p |</w:t>
+            </w:r>
+          </w:p>
+        </w:tc>
+      </w:tr>
+      <w:tr>
+        <w:trPr>
+          <w:trHeight w:val="1140"/>
+        </w:trPr>
+        <w:tc>
+          <w:tcPr>
+            <w:tcW w:w="3573" w:type="dxa"/>
+            <w:tcBorders>
+              <w:top w:val="single" w:sz="4" w:space="0" w:color="000000"/>
+              <w:left w:val="single" w:sz="4" w:space="0" w:color="000000"/>
+              <w:bottom w:val="single" w:sz="4" w:space="0" w:color="000000"/>
+              <w:right w:val="single" w:sz="4" w:space="0" w:color="000000"/>
+            </w:tcBorders>
+          </w:tcPr>
+          <w:p>
+            <w:pPr>
+              <w:widowControl w:val="0"/>
+              <w:autoSpaceDE w:val="0"/>
+              <w:autoSpaceDN w:val="0"/>
+              <w:adjustRightInd w:val="0"/>
+              <w:spacing w:before="0" w:line="240" w:lineRule="auto"/>
+              <w:rPr>
+                <w:rFonts w:cs="Arial"/>
+                <w:b/>
+                <w:sz w:val="28"/>
+                <w:szCs w:val="28"/>
+                <w:lang w:val="it-IT"/>
+              </w:rPr>
+            </w:pPr>
+            <w:r>
+              <w:rPr>
+                <w:rFonts w:cs="Arial"/>
+                <w:b/>
+                <w:sz w:val="28"/>
+                <w:szCs w:val="28"/>
+                <w:lang w:val="it-IT"/>
+              </w:rPr>
+              <w:t>TS 2.1.</w:t>
+            </w:r>
+            <w:r>
+              <w:rPr>
+                <w:rFonts w:cs="Arial"/>
+                <w:b/>
+                <w:sz w:val="28"/>
+                <w:szCs w:val="28"/>
+                <w:lang w:val="it-IT"/>
+              </w:rPr>
+              <w:t>11.5</w:t>
+            </w:r>
+            <w:r>
+              <w:rPr>
+                <w:rFonts w:cs="Arial"/>
+                <w:b/>
+                <w:sz w:val="28"/>
+                <w:szCs w:val="28"/>
+                <w:lang w:val="it-IT"/>
+              </w:rPr>
+              <w:t xml:space="preserve"> - Kramam</w:t>
+            </w:r>
+          </w:p>
+          <w:p>
+            <w:pPr>
+              <w:widowControl w:val="0"/>
+              <w:autoSpaceDE w:val="0"/>
+              <w:autoSpaceDN w:val="0"/>
+              <w:adjustRightInd w:val="0"/>
+              <w:spacing w:before="0" w:line="240" w:lineRule="auto"/>
+              <w:rPr>
+                <w:rFonts w:cs="Arial"/>
+                <w:b/>
+                <w:sz w:val="28"/>
+                <w:szCs w:val="28"/>
+                <w:lang w:val="it-IT"/>
+              </w:rPr>
+            </w:pPr>
+            <w:r>
+              <w:rPr>
+                <w:rFonts w:cs="Arial"/>
+                <w:b/>
+                <w:sz w:val="28"/>
+                <w:szCs w:val="28"/>
+                <w:lang w:val="it-IT"/>
+              </w:rPr>
+              <w:t xml:space="preserve">Krama Vaakyam No. </w:t>
+            </w:r>
+            <w:r>
+              <w:rPr>
+                <w:rFonts w:cs="Arial"/>
+                <w:b/>
+                <w:sz w:val="28"/>
+                <w:szCs w:val="28"/>
+                <w:lang w:val="it-IT"/>
+              </w:rPr>
+              <w:t>28</w:t>
+            </w:r>
+            <w:r>
+              <w:rPr>
+                <w:rFonts w:cs="Arial"/>
+                <w:b/>
+                <w:sz w:val="28"/>
+                <w:szCs w:val="28"/>
+                <w:lang w:val="it-IT"/>
+              </w:rPr>
+              <w:br/>
+              <w:t xml:space="preserve">Panchaati No.  </w:t>
+            </w:r>
+            <w:r>
+              <w:rPr>
+                <w:rFonts w:cs="Arial"/>
+                <w:b/>
+                <w:sz w:val="28"/>
+                <w:szCs w:val="28"/>
+                <w:lang w:val="it-IT"/>
+              </w:rPr>
+              <w:t>64</w:t>
+            </w:r>
+          </w:p>
+        </w:tc>
+        <w:tc>
+          <w:tcPr>
+            <w:tcW w:w="4896" w:type="dxa"/>
+            <w:tcBorders>
+              <w:top w:val="single" w:sz="4" w:space="0" w:color="000000"/>
+              <w:left w:val="single" w:sz="4" w:space="0" w:color="000000"/>
+              <w:bottom w:val="single" w:sz="4" w:space="0" w:color="000000"/>
+              <w:right w:val="single" w:sz="4" w:space="0" w:color="000000"/>
+            </w:tcBorders>
+          </w:tcPr>
+          <w:p>
+            <w:pPr>
+              <w:widowControl w:val="0"/>
+              <w:autoSpaceDE w:val="0"/>
+              <w:autoSpaceDN w:val="0"/>
+              <w:adjustRightInd w:val="0"/>
+              <w:spacing w:line="252" w:lineRule="auto"/>
+              <w:rPr>
+                <w:rFonts w:ascii="BRH Malayalam Extra" w:hAnsi="BRH Malayalam Extra" w:cs="BRH Malayalam Extra"/>
+                <w:color w:val="000000"/>
+                <w:sz w:val="40"/>
+                <w:szCs w:val="40"/>
+                <w:lang w:val="it-IT"/>
+              </w:rPr>
+            </w:pPr>
+            <w:r>
+              <w:rPr>
+                <w:rFonts w:ascii="BRH Malayalam Extra" w:hAnsi="BRH Malayalam Extra" w:cs="BRH Malayalam Extra"/>
+                <w:color w:val="000000"/>
+                <w:sz w:val="40"/>
+                <w:szCs w:val="40"/>
+              </w:rPr>
+              <w:t>Zõ</w:t>
+            </w:r>
+            <w:r>
+              <w:rPr>
+                <w:rFonts w:ascii="BRH Malayalam Extra" w:hAnsi="BRH Malayalam Extra" w:cs="BRH Malayalam Extra"/>
+                <w:color w:val="000000"/>
+                <w:sz w:val="40"/>
+                <w:szCs w:val="40"/>
+                <w:highlight w:val="yellow"/>
+              </w:rPr>
+              <w:t>xI</w:t>
+            </w:r>
+            <w:r>
+              <w:rPr>
+                <w:rFonts w:ascii="BRH Malayalam Extra" w:hAnsi="BRH Malayalam Extra" w:cs="BRH Malayalam Extra"/>
+                <w:color w:val="000000"/>
+                <w:sz w:val="40"/>
+                <w:szCs w:val="40"/>
+              </w:rPr>
+              <w:t xml:space="preserve"> d¡ | d¡ ±</w:t>
+            </w:r>
+            <w:r>
+              <w:rPr>
+                <w:rFonts w:ascii="BRH Malayalam Extra" w:hAnsi="BRH Malayalam Extra" w:cs="BRH Malayalam Extra"/>
+                <w:b/>
+                <w:color w:val="000000"/>
+                <w:sz w:val="32"/>
+                <w:szCs w:val="40"/>
+              </w:rPr>
+              <w:t>–</w:t>
+            </w:r>
+            <w:r>
+              <w:rPr>
+                <w:rFonts w:ascii="BRH Malayalam Extra" w:hAnsi="BRH Malayalam Extra" w:cs="BRH Malayalam Extra"/>
+                <w:color w:val="000000"/>
+                <w:sz w:val="40"/>
+                <w:szCs w:val="40"/>
+              </w:rPr>
+              <w:t>öZyjx</w:t>
+            </w:r>
+            <w:r>
+              <w:rPr>
+                <w:rFonts w:ascii="BRH Malayalam Extra" w:hAnsi="BRH Malayalam Extra" w:cs="BRH Malayalam Extra"/>
+                <w:color w:val="000000"/>
+                <w:sz w:val="40"/>
+                <w:szCs w:val="40"/>
+              </w:rPr>
+              <w:t>©</w:t>
+            </w:r>
+            <w:r>
+              <w:rPr>
+                <w:rFonts w:ascii="BRH Malayalam Extra" w:hAnsi="BRH Malayalam Extra" w:cs="BRH Malayalam Extra"/>
+                <w:color w:val="000000"/>
+                <w:sz w:val="40"/>
+                <w:szCs w:val="40"/>
+              </w:rPr>
+              <w:t>— |</w:t>
+            </w:r>
+          </w:p>
+        </w:tc>
+        <w:tc>
+          <w:tcPr>
+            <w:tcW w:w="5220" w:type="dxa"/>
+            <w:tcBorders>
+              <w:top w:val="single" w:sz="4" w:space="0" w:color="000000"/>
+              <w:left w:val="single" w:sz="4" w:space="0" w:color="000000"/>
+              <w:bottom w:val="single" w:sz="4" w:space="0" w:color="000000"/>
+              <w:right w:val="single" w:sz="4" w:space="0" w:color="000000"/>
+            </w:tcBorders>
+          </w:tcPr>
+          <w:p>
+            <w:pPr>
+              <w:widowControl w:val="0"/>
+              <w:autoSpaceDE w:val="0"/>
+              <w:autoSpaceDN w:val="0"/>
+              <w:adjustRightInd w:val="0"/>
+              <w:spacing w:line="252" w:lineRule="auto"/>
+              <w:rPr>
+                <w:rFonts w:ascii="BRH Malayalam Extra" w:hAnsi="BRH Malayalam Extra" w:cs="BRH Malayalam Extra"/>
+                <w:color w:val="000000"/>
+                <w:sz w:val="40"/>
+                <w:szCs w:val="40"/>
+                <w:lang w:val="it-IT"/>
+              </w:rPr>
+            </w:pPr>
+            <w:r>
+              <w:rPr>
+                <w:rFonts w:ascii="BRH Malayalam Extra" w:hAnsi="BRH Malayalam Extra" w:cs="BRH Malayalam Extra"/>
+                <w:color w:val="000000"/>
+                <w:sz w:val="40"/>
+                <w:szCs w:val="40"/>
+              </w:rPr>
+              <w:t>Zõx</w:t>
+            </w:r>
+            <w:r>
+              <w:rPr>
+                <w:rFonts w:ascii="BRH Malayalam Extra" w:hAnsi="BRH Malayalam Extra" w:cs="BRH Malayalam Extra"/>
+                <w:color w:val="000000"/>
+                <w:sz w:val="40"/>
+                <w:szCs w:val="40"/>
+                <w:highlight w:val="green"/>
+              </w:rPr>
+              <w:t>©</w:t>
+            </w:r>
+            <w:r>
+              <w:rPr>
+                <w:rFonts w:ascii="BRH Malayalam Extra" w:hAnsi="BRH Malayalam Extra" w:cs="BRH Malayalam Extra"/>
+                <w:color w:val="000000"/>
+                <w:sz w:val="40"/>
+                <w:szCs w:val="40"/>
+              </w:rPr>
+              <w:t xml:space="preserve"> d¡ | d¡ ±</w:t>
+            </w:r>
+            <w:r>
+              <w:rPr>
+                <w:rFonts w:ascii="BRH Malayalam Extra" w:hAnsi="BRH Malayalam Extra" w:cs="BRH Malayalam Extra"/>
+                <w:b/>
+                <w:color w:val="000000"/>
+                <w:sz w:val="32"/>
+                <w:szCs w:val="40"/>
+              </w:rPr>
+              <w:t>–</w:t>
+            </w:r>
+            <w:r>
+              <w:rPr>
+                <w:rFonts w:ascii="BRH Malayalam Extra" w:hAnsi="BRH Malayalam Extra" w:cs="BRH Malayalam Extra"/>
+                <w:color w:val="000000"/>
+                <w:sz w:val="40"/>
+                <w:szCs w:val="40"/>
+              </w:rPr>
+              <w:t>öZyjx</w:t>
+            </w:r>
+            <w:r>
+              <w:rPr>
+                <w:rFonts w:ascii="BRH Malayalam Extra" w:hAnsi="BRH Malayalam Extra" w:cs="BRH Malayalam Extra"/>
+                <w:color w:val="000000"/>
+                <w:sz w:val="40"/>
+                <w:szCs w:val="40"/>
+              </w:rPr>
+              <w:t>©</w:t>
+            </w:r>
+            <w:r>
+              <w:rPr>
+                <w:rFonts w:ascii="BRH Malayalam Extra" w:hAnsi="BRH Malayalam Extra" w:cs="BRH Malayalam Extra"/>
+                <w:color w:val="000000"/>
+                <w:sz w:val="40"/>
+                <w:szCs w:val="40"/>
+              </w:rPr>
+              <w:t>— |</w:t>
             </w:r>
           </w:p>
         </w:tc>
@@ -1667,6 +1982,7 @@
           <w:szCs w:val="32"/>
           <w:u w:val="single"/>
         </w:rPr>
+        <w:lastRenderedPageBreak/>
         <w:t xml:space="preserve">TS </w:t>
       </w:r>
       <w:r>
@@ -1839,7 +2155,6 @@
                 <w:sz w:val="28"/>
                 <w:szCs w:val="28"/>
               </w:rPr>
-              <w:lastRenderedPageBreak/>
               <w:t>Reference</w:t>
             </w:r>
           </w:p>
@@ -1866,7 +2181,6 @@
                 <w:sz w:val="28"/>
                 <w:szCs w:val="28"/>
               </w:rPr>
-              <w:lastRenderedPageBreak/>
               <w:t>As Printed</w:t>
             </w:r>
           </w:p>
@@ -3657,6 +3971,7 @@
           <w:szCs w:val="32"/>
           <w:u w:val="single"/>
         </w:rPr>
+        <w:lastRenderedPageBreak/>
         <w:t xml:space="preserve">TS </w:t>
       </w:r>
       <w:r>
@@ -3829,7 +4144,6 @@
                 <w:sz w:val="28"/>
                 <w:szCs w:val="28"/>
               </w:rPr>
-              <w:lastRenderedPageBreak/>
               <w:t>Reference</w:t>
             </w:r>
           </w:p>
@@ -3856,7 +4170,6 @@
                 <w:sz w:val="28"/>
                 <w:szCs w:val="28"/>
               </w:rPr>
-              <w:lastRenderedPageBreak/>
               <w:t>As Printed</w:t>
             </w:r>
           </w:p>
@@ -5563,6 +5876,15 @@
                 <w:szCs w:val="28"/>
               </w:rPr>
               <w:br/>
+            </w:r>
+            <w:r>
+              <w:rPr>
+                <w:rFonts w:cs="Arial"/>
+                <w:b/>
+                <w:sz w:val="28"/>
+                <w:szCs w:val="28"/>
+              </w:rPr>
+              <w:lastRenderedPageBreak/>
               <w:t xml:space="preserve">Panchaati </w:t>
             </w:r>
             <w:r>
@@ -5598,6 +5920,7 @@
                 <w:sz w:val="40"/>
                 <w:szCs w:val="40"/>
               </w:rPr>
+              <w:lastRenderedPageBreak/>
               <w:t>s</w:t>
             </w:r>
             <w:r>
@@ -5826,7 +6149,6 @@
                 <w:sz w:val="28"/>
                 <w:szCs w:val="28"/>
               </w:rPr>
-              <w:lastRenderedPageBreak/>
               <w:t>TS 2.1.4.2</w:t>
             </w:r>
             <w:r>
@@ -6874,16 +7196,36 @@
                 <w:sz w:val="28"/>
                 <w:szCs w:val="28"/>
               </w:rPr>
-              <w:t xml:space="preserve">TS 2.1.4.4 </w:t>
-            </w:r>
-            <w:r>
-              <w:rPr>
-                <w:rFonts w:cs="Arial"/>
-                <w:b/>
-                <w:sz w:val="28"/>
-                <w:szCs w:val="28"/>
-              </w:rPr>
-              <w:t xml:space="preserve"> - Kramam</w:t>
+              <w:t xml:space="preserve">TS </w:t>
+            </w:r>
+            <w:proofErr w:type="gramStart"/>
+            <w:r>
+              <w:rPr>
+                <w:rFonts w:cs="Arial"/>
+                <w:b/>
+                <w:sz w:val="28"/>
+                <w:szCs w:val="28"/>
+              </w:rPr>
+              <w:t xml:space="preserve">2.1.4.4 </w:t>
+            </w:r>
+            <w:r>
+              <w:rPr>
+                <w:rFonts w:cs="Arial"/>
+                <w:b/>
+                <w:sz w:val="28"/>
+                <w:szCs w:val="28"/>
+              </w:rPr>
+              <w:t xml:space="preserve"> -</w:t>
+            </w:r>
+            <w:proofErr w:type="gramEnd"/>
+            <w:r>
+              <w:rPr>
+                <w:rFonts w:cs="Arial"/>
+                <w:b/>
+                <w:sz w:val="28"/>
+                <w:szCs w:val="28"/>
+              </w:rPr>
+              <w:t xml:space="preserve"> Kramam</w:t>
             </w:r>
           </w:p>
           <w:p>
@@ -8282,6 +8624,7 @@
                 <w:sz w:val="28"/>
                 <w:szCs w:val="28"/>
               </w:rPr>
+              <w:lastRenderedPageBreak/>
               <w:t>TS 2.1.5.7 - Kramam</w:t>
             </w:r>
           </w:p>
@@ -8575,7 +8918,6 @@
                 <w:sz w:val="28"/>
                 <w:szCs w:val="28"/>
               </w:rPr>
-              <w:lastRenderedPageBreak/>
               <w:t xml:space="preserve">TS 2.1.6.1 </w:t>
             </w:r>
             <w:r>
@@ -10089,19 +10431,31 @@
                 <w:szCs w:val="40"/>
                 <w:highlight w:val="yellow"/>
               </w:rPr>
-              <w:t>m§.</w:t>
-            </w:r>
-            <w:r>
-              <w:rPr>
-                <w:rFonts w:ascii="BRH Malayalam Extra" w:hAnsi="BRH Malayalam Extra" w:cs="BRH Malayalam Extra"/>
-                <w:b/>
-                <w:color w:val="000000"/>
-                <w:sz w:val="28"/>
+              <w:t>m</w:t>
+            </w:r>
+            <w:proofErr w:type="gramStart"/>
+            <w:r>
+              <w:rPr>
+                <w:rFonts w:ascii="BRH Malayalam Extra" w:hAnsi="BRH Malayalam Extra" w:cs="BRH Malayalam Extra"/>
+                <w:color w:val="000000"/>
+                <w:sz w:val="36"/>
                 <w:szCs w:val="40"/>
                 <w:highlight w:val="yellow"/>
               </w:rPr>
-              <w:t>–</w:t>
-            </w:r>
+              <w:t>§.</w:t>
+            </w:r>
+            <w:r>
+              <w:rPr>
+                <w:rFonts w:ascii="BRH Malayalam Extra" w:hAnsi="BRH Malayalam Extra" w:cs="BRH Malayalam Extra"/>
+                <w:b/>
+                <w:color w:val="000000"/>
+                <w:sz w:val="28"/>
+                <w:szCs w:val="40"/>
+                <w:highlight w:val="yellow"/>
+              </w:rPr>
+              <w:t>–</w:t>
+            </w:r>
+            <w:proofErr w:type="gramEnd"/>
             <w:r>
               <w:rPr>
                 <w:rFonts w:ascii="BRH Malayalam Extra" w:hAnsi="BRH Malayalam Extra" w:cs="BRH Malayalam Extra"/>
@@ -10574,6 +10928,7 @@
                 <w:sz w:val="28"/>
                 <w:szCs w:val="28"/>
               </w:rPr>
+              <w:lastRenderedPageBreak/>
               <w:t xml:space="preserve">TS 2.1.9.3 </w:t>
             </w:r>
             <w:r>
@@ -10873,7 +11228,6 @@
                 <w:sz w:val="28"/>
                 <w:szCs w:val="28"/>
               </w:rPr>
-              <w:lastRenderedPageBreak/>
               <w:t xml:space="preserve">TS 2.1.11.1 </w:t>
             </w:r>
             <w:r>
@@ -12178,7 +12532,16 @@
           <w:bCs/>
           <w:sz w:val="32"/>
         </w:rPr>
-        <w:t>replaced with</w:t>
+        <w:t xml:space="preserve">replaced </w:t>
+      </w:r>
+      <w:proofErr w:type="gramStart"/>
+      <w:r>
+        <w:rPr>
+          <w:b/>
+          <w:bCs/>
+          <w:sz w:val="32"/>
+        </w:rPr>
+        <w:t>with</w:t>
       </w:r>
       <w:r>
         <w:rPr>
@@ -12198,7 +12561,29 @@
           <w:szCs w:val="40"/>
           <w:lang w:val="en-IN" w:eastAsia="en-IN"/>
         </w:rPr>
-        <w:t xml:space="preserve">"q§T"  </w:t>
+        <w:t>"</w:t>
+      </w:r>
+      <w:proofErr w:type="gramEnd"/>
+      <w:r>
+        <w:rPr>
+          <w:rFonts w:ascii="BRH Malayalam" w:hAnsi="BRH Malayalam" w:cs="BRH Malayalam"/>
+          <w:color w:val="000000"/>
+          <w:sz w:val="40"/>
+          <w:szCs w:val="40"/>
+          <w:lang w:val="en-IN" w:eastAsia="en-IN"/>
+        </w:rPr>
+        <w:t>q§T</w:t>
+      </w:r>
+      <w:proofErr w:type="gramStart"/>
+      <w:r>
+        <w:rPr>
+          <w:rFonts w:ascii="BRH Malayalam" w:hAnsi="BRH Malayalam" w:cs="BRH Malayalam"/>
+          <w:color w:val="000000"/>
+          <w:sz w:val="40"/>
+          <w:szCs w:val="40"/>
+          <w:lang w:val="en-IN" w:eastAsia="en-IN"/>
+        </w:rPr>
+        <w:t xml:space="preserve">"  </w:t>
       </w:r>
       <w:r>
         <w:rPr>
@@ -12206,7 +12591,16 @@
           <w:bCs/>
           <w:sz w:val="32"/>
         </w:rPr>
-        <w:t>wherever applicable</w:t>
+        <w:t>wherever</w:t>
+      </w:r>
+      <w:proofErr w:type="gramEnd"/>
+      <w:r>
+        <w:rPr>
+          <w:b/>
+          <w:bCs/>
+          <w:sz w:val="32"/>
+        </w:rPr>
+        <w:t xml:space="preserve"> applicable</w:t>
       </w:r>
     </w:p>
     <w:p>
@@ -12313,6 +12707,7 @@
           <w:szCs w:val="32"/>
           <w:u w:val="single"/>
         </w:rPr>
+        <w:lastRenderedPageBreak/>
         <w:t>TS Krama Paatam – TS 2.1 Malayalam Corrections – Observed Prior to 31st August 2021</w:t>
       </w:r>
     </w:p>
@@ -12395,7 +12790,6 @@
                 <w:sz w:val="28"/>
                 <w:szCs w:val="28"/>
               </w:rPr>
-              <w:lastRenderedPageBreak/>
               <w:t>Reference</w:t>
             </w:r>
           </w:p>
@@ -12422,7 +12816,6 @@
                 <w:sz w:val="28"/>
                 <w:szCs w:val="28"/>
               </w:rPr>
-              <w:lastRenderedPageBreak/>
               <w:t>As Printed</w:t>
             </w:r>
           </w:p>

</xml_diff>